<commit_message>
added method files but errors remaining
</commit_message>
<xml_diff>
--- a/01_Resources/handbook/PartI_NoMaster_TN8_RevD.docx
+++ b/01_Resources/handbook/PartI_NoMaster_TN8_RevD.docx
@@ -26749,7 +26749,7 @@
             <w:rPr>
               <w:b w:val="false"/>
             </w:rPr>
-            <w:t>30</w:t>
+            <w:t>24</w:t>
           </w:r>
           <w:r>
             <w:rPr>
@@ -27033,7 +27033,7 @@
             <w:rPr>
               <w:b w:val="false"/>
             </w:rPr>
-            <w:t>31</w:t>
+            <w:t>25</w:t>
           </w:r>
           <w:r>
             <w:rPr>
@@ -27141,7 +27141,7 @@
             <w:rPr>
               <w:b w:val="false"/>
             </w:rPr>
-            <w:t>38</w:t>
+            <w:t>32</w:t>
           </w:r>
           <w:r>
             <w:rPr>
@@ -27425,7 +27425,7 @@
             <w:rPr>
               <w:b w:val="false"/>
             </w:rPr>
-            <w:t>39</w:t>
+            <w:t>33</w:t>
           </w:r>
           <w:r>
             <w:rPr>
@@ -27533,7 +27533,7 @@
             <w:rPr>
               <w:b w:val="false"/>
             </w:rPr>
-            <w:t>48</w:t>
+            <w:t>46</w:t>
           </w:r>
           <w:r>
             <w:rPr>
@@ -27817,7 +27817,7 @@
             <w:rPr>
               <w:b w:val="false"/>
             </w:rPr>
-            <w:t>49</w:t>
+            <w:t>45</w:t>
           </w:r>
           <w:r>
             <w:rPr>

</xml_diff>